<commit_message>
Documents PV : 12 modeles (avis x AGPM x localite), chef-lieu, conversion resiliente
PvDocumentService.modelePour choisit parmi PV_{AFSR|AF|ANF}_{PPMAGPM|PPM}_{CENTRALE|REGIONALE}
(11 nouveaux gabarits Word + gabarit AFSR central mis a jour) ; seuil NSP sans modele.
Lieu d'etablissement « A <chef-lieu>, le » : colonne tr_localite.CHEF_LIEU (repli
libelle), Localite.ID_CENTRALE/estCentrale. Resilience documents4j : convertisseur
recree si non operationnel + retry (PV et lettres de renvoi). Contexte PV : chefLieu,
numMaj (MODIFICATIF N.n), drapeau piece des observations (annexe).

Co-Authored-By: Claude Fable 5 <noreply@anthropic.com>
Claude-Session: https://claude.ai/code/session_01DaFUTopa7ifkwnvQYjDRKP
</commit_message>
<xml_diff>
--- a/src/main/resources/templates/PV_AFSR_PPMAGPM_CENTRALE.docx
+++ b/src/main/resources/templates/PV_AFSR_PPMAGPM_CENTRALE.docx
@@ -1762,7 +1762,7 @@
                 <w:b/>
                 <w:sz w:val="20"/>
               </w:rPr>
-              <w:t>VISA</w:t>
+              <w:t xml:space="preserve">VISA</w:t>
             </w:r>
             <w:r>
               <w:rPr>
@@ -1779,7 +1779,7 @@
                 <w:b/>
                 <w:sz w:val="20"/>
               </w:rPr>
-              <w:t>DU</w:t>
+              <w:t xml:space="preserve">DU</w:t>
             </w:r>
             <w:r>
               <w:rPr>
@@ -1796,7 +1796,7 @@
                 <w:b/>
                 <w:sz w:val="20"/>
               </w:rPr>
-              <w:t>SUPERIEUR</w:t>
+              <w:t xml:space="preserve">SUPERIEUR</w:t>
             </w:r>
             <w:r>
               <w:rPr>
@@ -1814,7 +1814,7 @@
                 <w:spacing w:val="-2"/>
                 <w:sz w:val="20"/>
               </w:rPr>
-              <w:t>HIERARCHIQUE</w:t>
+              <w:t xml:space="preserve">HIERARCHIQUE</w:t>
             </w:r>
           </w:p>
           <w:p>
@@ -1834,7 +1834,7 @@
                 <w:i/>
                 <w:sz w:val="20"/>
               </w:rPr>
-              <w:t>(Nom,</w:t>
+              <w:t xml:space="preserve">(Nom,</w:t>
             </w:r>
             <w:r>
               <w:rPr>
@@ -1851,7 +1851,7 @@
                 <w:i/>
                 <w:sz w:val="20"/>
               </w:rPr>
-              <w:t>prénoms,</w:t>
+              <w:t xml:space="preserve">prénoms,</w:t>
             </w:r>
             <w:r>
               <w:rPr>
@@ -1868,7 +1868,7 @@
                 <w:i/>
                 <w:sz w:val="20"/>
               </w:rPr>
-              <w:t>cachet</w:t>
+              <w:t xml:space="preserve">cachet</w:t>
             </w:r>
             <w:r>
               <w:rPr>
@@ -1885,7 +1885,7 @@
                 <w:i/>
                 <w:sz w:val="20"/>
               </w:rPr>
-              <w:t>et</w:t>
+              <w:t xml:space="preserve">et</w:t>
             </w:r>
             <w:r>
               <w:rPr>
@@ -1902,7 +1902,7 @@
                 <w:i/>
                 <w:sz w:val="20"/>
               </w:rPr>
-              <w:t>signature</w:t>
+              <w:t xml:space="preserve">signature</w:t>
             </w:r>
             <w:r>
               <w:rPr>
@@ -1919,7 +1919,7 @@
                 <w:i/>
                 <w:sz w:val="20"/>
               </w:rPr>
-              <w:t>du supérieur hiérarchique)</w:t>
+              <w:t xml:space="preserve">du supérieur hiérarchique)</w:t>
             </w:r>
           </w:p>
         </w:tc>
@@ -1954,7 +1954,7 @@
                 <w:spacing w:val="-10"/>
                 <w:sz w:val="20"/>
               </w:rPr>
-              <w:t>&lt;LOCALITE&gt;</w:t>
+              <w:t xml:space="preserve">&lt;CHEF LIEU&gt;</w:t>
             </w:r>
             <w:r>
               <w:rPr>
@@ -1963,7 +1963,7 @@
                 <w:spacing w:val="-2"/>
                 <w:sz w:val="20"/>
               </w:rPr>
-              <w:t>,</w:t>
+              <w:t xml:space="preserve">,</w:t>
             </w:r>
             <w:r>
               <w:rPr>
@@ -1990,7 +1990,7 @@
                 <w:spacing w:val="-10"/>
                 <w:sz w:val="20"/>
               </w:rPr>
-              <w:t>&lt;DATE AUJOURD’HUI&gt;</w:t>
+              <w:t xml:space="preserve">&lt;DATE AUJOURD’HUI&gt;</w:t>
             </w:r>
           </w:p>
           <w:p>
@@ -2010,7 +2010,7 @@
                 <w:i/>
                 <w:sz w:val="20"/>
               </w:rPr>
-              <w:t>(Nom,</w:t>
+              <w:t xml:space="preserve">(Nom,</w:t>
             </w:r>
             <w:r>
               <w:rPr>
@@ -2027,7 +2027,7 @@
                 <w:i/>
                 <w:sz w:val="20"/>
               </w:rPr>
-              <w:t>prénoms,</w:t>
+              <w:t xml:space="preserve">prénoms,</w:t>
             </w:r>
             <w:r>
               <w:rPr>
@@ -2044,7 +2044,7 @@
                 <w:i/>
                 <w:sz w:val="20"/>
               </w:rPr>
-              <w:t>cachet</w:t>
+              <w:t xml:space="preserve">cachet</w:t>
             </w:r>
             <w:r>
               <w:rPr>
@@ -2061,7 +2061,7 @@
                 <w:i/>
                 <w:sz w:val="20"/>
               </w:rPr>
-              <w:t>et</w:t>
+              <w:t xml:space="preserve">et</w:t>
             </w:r>
             <w:r>
               <w:rPr>
@@ -2078,7 +2078,7 @@
                 <w:i/>
                 <w:sz w:val="20"/>
               </w:rPr>
-              <w:t>signature</w:t>
+              <w:t xml:space="preserve">signature</w:t>
             </w:r>
             <w:r>
               <w:rPr>
@@ -2095,7 +2095,7 @@
                 <w:i/>
                 <w:sz w:val="20"/>
               </w:rPr>
-              <w:t>du</w:t>
+              <w:t xml:space="preserve">du</w:t>
             </w:r>
             <w:r>
               <w:rPr>
@@ -2112,7 +2112,7 @@
                 <w:i/>
                 <w:sz w:val="20"/>
               </w:rPr>
-              <w:t>membre en charge du dossier)</w:t>
+              <w:t xml:space="preserve">membre en charge du dossier)</w:t>
             </w:r>
           </w:p>
         </w:tc>

</xml_diff>